<commit_message>
Finalize pair-state-consistent PCL submission
</commit_message>
<xml_diff>
--- a/problems/03_pcl_assortment/business_description.docx
+++ b/problems/03_pcl_assortment/business_description.docx
@@ -13,7 +13,7 @@
           <w:color w:val="1F1F1F"/>
           <w:sz w:val="40"/>
         </w:rPr>
-        <w:t>Limited-Display PCL Assortment Planning</w:t>
+        <w:t>Pair-State Consistency in Paired Combinatorial Logit Assortment Planning</w:t>
       </w:r>
     </w:p>
     <w:p>
@@ -43,7 +43,7 @@
         <w:keepLines/>
       </w:pPr>
       <w:r>
-        <w:t>Our category team must choose up to four products for a limited retail display. For each product, the demand-science team has estimated a customer-attraction weight and a normalized contribution margin. It has also calibrated a standard paired combinatorial logit (PCL) choice model, with a dissimilarity estimate for every unordered product pair and an outside-option weight for customers who leave without purchasing. Choose the assortment that maximizes expected contribution margin while accounting for substitution among the offered products.</w:t>
+        <w:t>A retailer must choose up to four products for a limited display. The demand science team has estimated an attraction weight and a normalized contribution margin for each product. It has also calibrated a paired combinatorial logit choice model with a dissimilarity parameter for every unordered product pair and an outside-option weight for customers who leave without purchasing. The retailer selects the assortment that maximizes expected contribution margin while accounting for substitution among the displayed products.</w:t>
       </w:r>
     </w:p>
     <w:sectPr>

</xml_diff>